<commit_message>
Do a fianl Final version
</commit_message>
<xml_diff>
--- a/project_2/lab_report_2_Eremenko.docx
+++ b/project_2/lab_report_2_Eremenko.docx
@@ -275,7 +275,7 @@
             </w:rPr>
             <w:fldChar w:fldCharType="separate"/>
           </w:r>
-          <w:hyperlink w:anchor="__RefHeading___Toc2597_3177650637" w:tooltip="Цель работы">
+          <w:hyperlink w:anchor="__RefHeading___Toc4295_3177650637" w:tooltip="Цель работы">
             <w:bookmarkStart w:id="0" w:name="_Toc243321928"/>
             <w:r>
               <w:rPr>
@@ -298,7 +298,7 @@
             </w:tabs>
             <w:rPr/>
           </w:pPr>
-          <w:hyperlink w:anchor="__RefHeading___Toc2599_3177650637" w:tooltip="Описание задачи">
+          <w:hyperlink w:anchor="__RefHeading___Toc4297_3177650637" w:tooltip="Описание задачи">
             <w:r>
               <w:rPr>
                 <w:rStyle w:val="IndexLink"/>
@@ -320,7 +320,7 @@
             </w:tabs>
             <w:rPr/>
           </w:pPr>
-          <w:hyperlink w:anchor="__RefHeading___Toc2601_3177650637" w:tooltip="Теоретическая часть">
+          <w:hyperlink w:anchor="__RefHeading___Toc4299_3177650637" w:tooltip="Теоретическая часть">
             <w:r>
               <w:rPr>
                 <w:rStyle w:val="IndexLink"/>
@@ -342,7 +342,7 @@
             </w:tabs>
             <w:rPr/>
           </w:pPr>
-          <w:hyperlink w:anchor="__RefHeading___Toc2603_3177650637" w:tooltip="Классификация столбцов датасета">
+          <w:hyperlink w:anchor="__RefHeading___Toc4301_3177650637" w:tooltip="Классификация столбцов датасета">
             <w:r>
               <w:rPr>
                 <w:rStyle w:val="IndexLink"/>
@@ -364,7 +364,7 @@
             </w:tabs>
             <w:rPr/>
           </w:pPr>
-          <w:hyperlink w:anchor="__RefHeading___Toc2605_3177650637" w:tooltip="Уровни обобщения">
+          <w:hyperlink w:anchor="__RefHeading___Toc4303_3177650637" w:tooltip="Уровни обобщения">
             <w:r>
               <w:rPr>
                 <w:rStyle w:val="IndexLink"/>
@@ -386,7 +386,7 @@
             </w:tabs>
             <w:rPr/>
           </w:pPr>
-          <w:hyperlink w:anchor="__RefHeading___Toc2607_3177650637" w:tooltip="Алгоритм подбора уровней обобщения">
+          <w:hyperlink w:anchor="__RefHeading___Toc4305_3177650637" w:tooltip="Алгоритм подбора уровней обобщения">
             <w:r>
               <w:rPr>
                 <w:rStyle w:val="IndexLink"/>
@@ -408,7 +408,7 @@
             </w:tabs>
             <w:rPr/>
           </w:pPr>
-          <w:hyperlink w:anchor="__RefHeading___Toc2609_3177650637" w:tooltip="Метрика полезности">
+          <w:hyperlink w:anchor="__RefHeading___Toc4307_3177650637" w:tooltip="Метрика полезности">
             <w:r>
               <w:rPr>
                 <w:rStyle w:val="IndexLink"/>
@@ -430,7 +430,7 @@
             </w:tabs>
             <w:rPr/>
           </w:pPr>
-          <w:hyperlink w:anchor="__RefHeading___Toc2611_3177650637" w:tooltip="Основные шаги программы">
+          <w:hyperlink w:anchor="__RefHeading___Toc4309_3177650637" w:tooltip="Основные шаги программы">
             <w:r>
               <w:rPr>
                 <w:rStyle w:val="IndexLink"/>
@@ -452,7 +452,7 @@
             </w:tabs>
             <w:rPr/>
           </w:pPr>
-          <w:hyperlink w:anchor="__RefHeading___Toc2613_3177650637" w:tooltip="Блок схема программы">
+          <w:hyperlink w:anchor="__RefHeading___Toc4311_3177650637" w:tooltip="Блок схема программы">
             <w:r>
               <w:rPr>
                 <w:rStyle w:val="IndexLink"/>
@@ -474,7 +474,7 @@
             </w:tabs>
             <w:rPr/>
           </w:pPr>
-          <w:hyperlink w:anchor="__RefHeading___Toc2615_3177650637" w:tooltip="Описание программы">
+          <w:hyperlink w:anchor="__RefHeading___Toc4313_3177650637" w:tooltip="Описание программы">
             <w:r>
               <w:rPr>
                 <w:rStyle w:val="IndexLink"/>
@@ -496,7 +496,7 @@
             </w:tabs>
             <w:rPr/>
           </w:pPr>
-          <w:hyperlink w:anchor="__RefHeading___Toc2617_3177650637" w:tooltip="Рекомендации пользователя">
+          <w:hyperlink w:anchor="__RefHeading___Toc4315_3177650637" w:tooltip="Рекомендации пользователя">
             <w:r>
               <w:rPr>
                 <w:rStyle w:val="IndexLink"/>
@@ -518,7 +518,7 @@
             </w:tabs>
             <w:rPr/>
           </w:pPr>
-          <w:hyperlink w:anchor="__RefHeading___Toc2619_3177650637" w:tooltip="Рекомендации программиста">
+          <w:hyperlink w:anchor="__RefHeading___Toc4317_3177650637" w:tooltip="Рекомендации программиста">
             <w:r>
               <w:rPr>
                 <w:rStyle w:val="IndexLink"/>
@@ -540,7 +540,7 @@
             </w:tabs>
             <w:rPr/>
           </w:pPr>
-          <w:hyperlink w:anchor="__RefHeading___Toc2621_3177650637" w:tooltip="Контрольный пример">
+          <w:hyperlink w:anchor="__RefHeading___Toc4319_3177650637" w:tooltip="Контрольный пример">
             <w:r>
               <w:rPr>
                 <w:rStyle w:val="IndexLink"/>
@@ -562,7 +562,7 @@
             </w:tabs>
             <w:rPr/>
           </w:pPr>
-          <w:hyperlink w:anchor="__RefHeading___Toc2623_3177650637" w:tooltip="Исследование">
+          <w:hyperlink w:anchor="__RefHeading___Toc4321_3177650637" w:tooltip="Исследование">
             <w:r>
               <w:rPr>
                 <w:rStyle w:val="IndexLink"/>
@@ -584,7 +584,7 @@
             </w:tabs>
             <w:rPr/>
           </w:pPr>
-          <w:hyperlink w:anchor="__RefHeading___Toc2625_3177650637" w:tooltip="Вывод">
+          <w:hyperlink w:anchor="__RefHeading___Toc4323_3177650637" w:tooltip="Вывод">
             <w:r>
               <w:rPr>
                 <w:rStyle w:val="IndexLink"/>
@@ -648,7 +648,7 @@
           <w:lang w:val="ru-RU"/>
         </w:rPr>
       </w:pPr>
-      <w:bookmarkStart w:id="1" w:name="__RefHeading___Toc2597_3177650637"/>
+      <w:bookmarkStart w:id="1" w:name="__RefHeading___Toc4295_3177650637"/>
       <w:bookmarkStart w:id="2" w:name="_Toc243341350"/>
       <w:bookmarkEnd w:id="1"/>
       <w:r>
@@ -694,7 +694,7 @@
           <w:lang w:val="ru-RU"/>
         </w:rPr>
       </w:pPr>
-      <w:bookmarkStart w:id="3" w:name="__RefHeading___Toc2599_3177650637"/>
+      <w:bookmarkStart w:id="3" w:name="__RefHeading___Toc4297_3177650637"/>
       <w:bookmarkStart w:id="4" w:name="_Toc243341351"/>
       <w:bookmarkStart w:id="5" w:name="_Toc243321929"/>
       <w:bookmarkEnd w:id="3"/>
@@ -753,27 +753,7 @@
         <w:rPr>
           <w:lang w:val="ru-RU"/>
         </w:rPr>
-        <w:t xml:space="preserve">загрузить датасет и посчитать для него </w:t>
-      </w:r>
-      <w:r>
-        <w:rPr/>
-        <w:t>k</w:t>
-      </w:r>
-      <w:r>
-        <w:rPr>
-          <w:lang w:val="ru-RU"/>
-        </w:rPr>
-        <w:t>-</w:t>
-      </w:r>
-      <w:r>
-        <w:rPr/>
-        <w:t>anonymity</w:t>
-      </w:r>
-      <w:r>
-        <w:rPr>
-          <w:lang w:val="ru-RU"/>
-        </w:rPr>
-        <w:t>, после вывести несколько уникальных строк.</w:t>
+        <w:t>загрузить датасет и посчитать для него k-anonymity по всем столбцам, после вывести несколько уникальных строк.</w:t>
       </w:r>
     </w:p>
     <w:p>
@@ -827,7 +807,7 @@
         <w:rPr>
           <w:lang w:val="ru-RU"/>
         </w:rPr>
-        <w:t>посчитать k-anonymity по выбранным квази-идентификаторам для входного датасета и для датасета после обезличивания.</w:t>
+        <w:t>посчитать k-anonymity по выбранным квази-идентификаторам для датасета после обезличивания.</w:t>
       </w:r>
     </w:p>
     <w:p>
@@ -965,7 +945,7 @@
           <w:lang w:val="ru-RU"/>
         </w:rPr>
       </w:pPr>
-      <w:bookmarkStart w:id="6" w:name="__RefHeading___Toc2601_3177650637"/>
+      <w:bookmarkStart w:id="6" w:name="__RefHeading___Toc4299_3177650637"/>
       <w:bookmarkStart w:id="7" w:name="_Toc243341352"/>
       <w:bookmarkStart w:id="8" w:name="_Toc243321930"/>
       <w:bookmarkEnd w:id="6"/>
@@ -1102,7 +1082,7 @@
         <w:rPr>
           <w:lang w:val="ru-RU"/>
         </w:rPr>
-        <w:t>Для оценки обезличенности используется метрика k-anonymity. Строки датасета группируются по совпадающим значениям квази-идентификаторов, и K – это размер самой маленькой такой группы. Если K = 1, то в датасете есть хотя бы одна уникальная строка, по которой можно однозначно найти человека, зная значения его квази-идентификаторов. Чем больше K, тем больше людей «прячется» в каждой группе.</w:t>
+        <w:t>Для оценки обезличенности используется метрика k-anonymity. Строки датасета группируются по совпадающим значениям квази-идентификаторов, и K – это размер самой маленькой такой группы. Если K = 1, то в датасете есть хотя бы одна уникальная строка, по которой можно однозначно найти человека, зная значения его квази-идентификаторов. Чем больше K, тем больше людей «прячется» в каждой группе. Для входного датасета K считается по всем столбцам, чтобы показать, насколько уникальны исходные записи, а для обезличенного – по выбранным квази-идентификаторам.</w:t>
       </w:r>
     </w:p>
     <w:p>
@@ -1163,7 +1143,7 @@
           <w:lang w:val="ru-RU"/>
         </w:rPr>
       </w:pPr>
-      <w:bookmarkStart w:id="9" w:name="__RefHeading___Toc2603_3177650637"/>
+      <w:bookmarkStart w:id="9" w:name="__RefHeading___Toc4301_3177650637"/>
       <w:bookmarkStart w:id="10" w:name="_Toc243341353"/>
       <w:bookmarkStart w:id="11" w:name="_Toc243321931"/>
       <w:bookmarkEnd w:id="9"/>
@@ -2383,7 +2363,7 @@
           <w:lang w:val="ru-RU"/>
         </w:rPr>
       </w:pPr>
-      <w:bookmarkStart w:id="12" w:name="__RefHeading___Toc2605_3177650637"/>
+      <w:bookmarkStart w:id="12" w:name="__RefHeading___Toc4303_3177650637"/>
       <w:bookmarkStart w:id="13" w:name="_Toc243341354"/>
       <w:bookmarkStart w:id="14" w:name="_Toc243321932"/>
       <w:bookmarkEnd w:id="12"/>
@@ -3138,7 +3118,7 @@
           <w:lang w:val="ru-RU"/>
         </w:rPr>
       </w:pPr>
-      <w:bookmarkStart w:id="15" w:name="__RefHeading___Toc2607_3177650637"/>
+      <w:bookmarkStart w:id="15" w:name="__RefHeading___Toc4305_3177650637"/>
       <w:bookmarkStart w:id="16" w:name="_Toc243341355"/>
       <w:bookmarkStart w:id="17" w:name="_Toc243321933"/>
       <w:bookmarkEnd w:id="15"/>
@@ -3226,7 +3206,7 @@
           <w:lang w:val="ru-RU"/>
         </w:rPr>
       </w:pPr>
-      <w:bookmarkStart w:id="18" w:name="__RefHeading___Toc2609_3177650637"/>
+      <w:bookmarkStart w:id="18" w:name="__RefHeading___Toc4307_3177650637"/>
       <w:bookmarkStart w:id="19" w:name="_Toc243341356"/>
       <w:bookmarkStart w:id="20" w:name="_Toc243321934"/>
       <w:bookmarkEnd w:id="18"/>
@@ -3287,7 +3267,7 @@
           <w:lang w:val="ru-RU"/>
         </w:rPr>
       </w:pPr>
-      <w:bookmarkStart w:id="21" w:name="__RefHeading___Toc2611_3177650637"/>
+      <w:bookmarkStart w:id="21" w:name="__RefHeading___Toc4309_3177650637"/>
       <w:bookmarkStart w:id="22" w:name="_Toc243341357"/>
       <w:bookmarkStart w:id="23" w:name="_Toc243321935"/>
       <w:bookmarkEnd w:id="21"/>
@@ -3336,7 +3316,7 @@
         <w:rPr>
           <w:lang w:val="ru-RU"/>
         </w:rPr>
-        <w:t>Пользователь выбирает квази-идентификаторы, вводя их номера через пробел. Если ввод неправильный (не число, номера нет в списке или строка пустая) – программа сообщает об ошибке и просит ввести номера заново.</w:t>
+        <w:t>Считается значение k для необезличенного датасета по всем столбцам и выводятся k, худшие значения k и 10 уникальных строк.</w:t>
       </w:r>
     </w:p>
     <w:p>
@@ -3354,37 +3334,7 @@
         <w:rPr>
           <w:lang w:val="ru-RU"/>
         </w:rPr>
-        <w:t xml:space="preserve">Считается значение </w:t>
-      </w:r>
-      <w:r>
-        <w:rPr/>
-        <w:t>k</w:t>
-      </w:r>
-      <w:r>
-        <w:rPr>
-          <w:lang w:val="ru-RU"/>
-        </w:rPr>
-        <w:t xml:space="preserve"> для необезличенного датасета по выбранным квази-идентификаторам и выводятся </w:t>
-      </w:r>
-      <w:r>
-        <w:rPr/>
-        <w:t>k</w:t>
-      </w:r>
-      <w:r>
-        <w:rPr>
-          <w:lang w:val="ru-RU"/>
-        </w:rPr>
-        <w:t xml:space="preserve">, худшие значения </w:t>
-      </w:r>
-      <w:r>
-        <w:rPr/>
-        <w:t>k</w:t>
-      </w:r>
-      <w:r>
-        <w:rPr>
-          <w:lang w:val="ru-RU"/>
-        </w:rPr>
-        <w:t xml:space="preserve"> и 10 уникальных строк.</w:t>
+        <w:t>Пользователь выбирает квази-идентификаторы, вводя их номера через пробел. Если ввод неправильный (не число, номера нет в списке или строка пустая) – программа сообщает об ошибке и просит ввести номера заново.</w:t>
       </w:r>
     </w:p>
     <w:p>
@@ -3512,7 +3462,7 @@
           <w:lang w:val="ru-RU"/>
         </w:rPr>
       </w:pPr>
-      <w:bookmarkStart w:id="24" w:name="__RefHeading___Toc2613_3177650637"/>
+      <w:bookmarkStart w:id="24" w:name="__RefHeading___Toc4311_3177650637"/>
       <w:bookmarkStart w:id="25" w:name="_Toc243341358"/>
       <w:bookmarkStart w:id="26" w:name="_Toc243321936"/>
       <w:bookmarkEnd w:id="24"/>
@@ -3563,6 +3513,105 @@
           <w:b/>
           <w:sz w:val="32"/>
           <w:szCs w:val="32"/>
+          <w:lang w:val="ru-RU"/>
+        </w:rPr>
+      </w:pPr>
+      <w:r>
+        <w:rPr/>
+        <w:drawing>
+          <wp:anchor distT="0" distB="0" distL="0" distR="0" simplePos="0" relativeHeight="11" behindDoc="0" locked="0" layoutInCell="0" allowOverlap="1">
+            <wp:simplePos x="0" y="0"/>
+            <wp:positionH relativeFrom="column">
+              <wp:align>center</wp:align>
+            </wp:positionH>
+            <wp:positionV relativeFrom="paragraph">
+              <wp:posOffset>635</wp:posOffset>
+            </wp:positionV>
+            <wp:extent cx="5939790" cy="6471285"/>
+            <wp:effectExtent l="0" t="0" r="0" b="0"/>
+            <wp:wrapSquare wrapText="largest"/>
+            <wp:docPr id="1" name="Image2"/>
+            <wp:cNvGraphicFramePr>
+              <a:graphicFrameLocks xmlns:a="http://schemas.openxmlformats.org/drawingml/2006/main" noChangeAspect="1"/>
+            </wp:cNvGraphicFramePr>
+            <a:graphic xmlns:a="http://schemas.openxmlformats.org/drawingml/2006/main">
+              <a:graphicData uri="http://schemas.openxmlformats.org/drawingml/2006/picture">
+                <pic:pic xmlns:pic="http://schemas.openxmlformats.org/drawingml/2006/picture">
+                  <pic:nvPicPr>
+                    <pic:cNvPr id="1" name="Image2"/>
+                    <pic:cNvPicPr>
+                      <a:picLocks noChangeAspect="1" noChangeArrowheads="1"/>
+                    </pic:cNvPicPr>
+                  </pic:nvPicPr>
+                  <pic:blipFill>
+                    <a:blip r:embed="rId2"/>
+                    <a:stretch>
+                      <a:fillRect/>
+                    </a:stretch>
+                  </pic:blipFill>
+                  <pic:spPr bwMode="auto">
+                    <a:xfrm>
+                      <a:off x="0" y="0"/>
+                      <a:ext cx="5939790" cy="6471285"/>
+                    </a:xfrm>
+                    <a:prstGeom prst="rect">
+                      <a:avLst/>
+                    </a:prstGeom>
+                    <a:noFill/>
+                  </pic:spPr>
+                </pic:pic>
+              </a:graphicData>
+            </a:graphic>
+          </wp:anchor>
+        </w:drawing>
+      </w:r>
+    </w:p>
+    <w:p>
+      <w:pPr>
+        <w:pStyle w:val="Normal"/>
+        <w:ind w:hanging="0"/>
+        <w:jc w:val="center"/>
+        <w:rPr>
+          <w:sz w:val="24"/>
+          <w:szCs w:val="24"/>
+          <w:lang w:val="ru-RU"/>
+        </w:rPr>
+      </w:pPr>
+      <w:r>
+        <w:rPr>
+          <w:sz w:val="24"/>
+          <w:szCs w:val="24"/>
+          <w:lang w:val="ru-RU"/>
+        </w:rPr>
+        <w:t>рисунок 5.1 – Блок-схема основного алгоритма программы</w:t>
+      </w:r>
+    </w:p>
+    <w:p>
+      <w:pPr>
+        <w:pStyle w:val="Normal"/>
+        <w:spacing w:lineRule="auto" w:line="240"/>
+        <w:ind w:hanging="0"/>
+        <w:jc w:val="start"/>
+        <w:rPr>
+          <w:lang w:val="ru-RU"/>
+        </w:rPr>
+      </w:pPr>
+      <w:r>
+        <w:rPr>
+          <w:lang w:val="ru-RU"/>
+        </w:rPr>
+      </w:r>
+      <w:r>
+        <w:br w:type="page"/>
+      </w:r>
+    </w:p>
+    <w:p>
+      <w:pPr>
+        <w:pStyle w:val="Normal"/>
+        <w:spacing w:lineRule="auto" w:line="240" w:before="0" w:after="0"/>
+        <w:ind w:hanging="0"/>
+        <w:jc w:val="center"/>
+        <w:rPr>
           <w:lang w:val="ru-RU"/>
         </w:rPr>
       </w:pPr>
@@ -3572,24 +3621,24 @@
           <mc:Choice Requires="wps">
             <w:drawing>
               <wp:inline distT="0" distB="0" distL="0" distR="0">
-                <wp:extent cx="5934075" cy="7153275"/>
+                <wp:extent cx="5934075" cy="7667625"/>
                 <wp:effectExtent l="0" t="0" r="0" b="0"/>
-                <wp:docPr id="1" name=""/>
+                <wp:docPr id="2" name=""/>
                 <a:graphic xmlns:a="http://schemas.openxmlformats.org/drawingml/2006/main">
                   <a:graphicData uri="http://schemas.openxmlformats.org/drawingml/2006/picture">
                     <pic:pic xmlns:pic="http://schemas.openxmlformats.org/drawingml/2006/picture">
                       <pic:nvPicPr>
-                        <pic:cNvPr id="2" name=""/>
+                        <pic:cNvPr id="3" name=""/>
                         <pic:cNvPicPr/>
                       </pic:nvPicPr>
                       <pic:blipFill>
-                        <a:blip r:embed="rId2"/>
+                        <a:blip r:embed="rId3"/>
                         <a:stretch/>
                       </pic:blipFill>
                       <pic:spPr>
                         <a:xfrm>
                           <a:off x="0" y="0"/>
-                          <a:ext cx="5934240" cy="7153200"/>
+                          <a:ext cx="5934240" cy="7667640"/>
                         </a:xfrm>
                         <a:prstGeom prst="rect">
                           <a:avLst/>
@@ -3626,107 +3675,8 @@
                 <v:path o:extrusionok="f" gradientshapeok="t" o:connecttype="rect"/>
                 <o:lock v:ext="edit" aspectratio="t"/>
               </v:shapetype>
-              <v:shape id="shape_0" stroked="f" o:allowincell="t" style="width:467.2pt;height:563.2pt;mso-wrap-style:none;v-text-anchor:middle" type="_x0000_t75">
-                <v:imagedata r:id="rId3" o:detectmouseclick="t"/>
-                <v:stroke color="#3465a4" joinstyle="round" endcap="flat"/>
-              </v:shape>
-            </w:pict>
-          </mc:Fallback>
-        </mc:AlternateContent>
-      </w:r>
-    </w:p>
-    <w:p>
-      <w:pPr>
-        <w:pStyle w:val="Normal"/>
-        <w:ind w:hanging="0"/>
-        <w:jc w:val="center"/>
-        <w:rPr>
-          <w:sz w:val="24"/>
-          <w:szCs w:val="24"/>
-          <w:lang w:val="ru-RU"/>
-        </w:rPr>
-      </w:pPr>
-      <w:r>
-        <w:rPr>
-          <w:sz w:val="24"/>
-          <w:szCs w:val="24"/>
-          <w:lang w:val="ru-RU"/>
-        </w:rPr>
-        <w:t>рисунок 5.1 – Блок-схема основного алгоритма программы</w:t>
-      </w:r>
-    </w:p>
-    <w:p>
-      <w:pPr>
-        <w:pStyle w:val="Normal"/>
-        <w:spacing w:lineRule="auto" w:line="240"/>
-        <w:ind w:hanging="0"/>
-        <w:jc w:val="start"/>
-        <w:rPr>
-          <w:lang w:val="ru-RU"/>
-        </w:rPr>
-      </w:pPr>
-      <w:r>
-        <w:rPr>
-          <w:lang w:val="ru-RU"/>
-        </w:rPr>
-      </w:r>
-      <w:r>
-        <w:br w:type="page"/>
-      </w:r>
-    </w:p>
-    <w:p>
-      <w:pPr>
-        <w:pStyle w:val="Normal"/>
-        <w:spacing w:lineRule="auto" w:line="240" w:before="0" w:after="0"/>
-        <w:ind w:hanging="0"/>
-        <w:jc w:val="center"/>
-        <w:rPr>
-          <w:lang w:val="ru-RU"/>
-        </w:rPr>
-      </w:pPr>
-      <w:r>
-        <w:rPr/>
-        <mc:AlternateContent>
-          <mc:Choice Requires="wps">
-            <w:drawing>
-              <wp:inline distT="0" distB="0" distL="0" distR="0">
-                <wp:extent cx="5934075" cy="7667625"/>
-                <wp:effectExtent l="0" t="0" r="0" b="0"/>
-                <wp:docPr id="3" name=""/>
-                <a:graphic xmlns:a="http://schemas.openxmlformats.org/drawingml/2006/main">
-                  <a:graphicData uri="http://schemas.openxmlformats.org/drawingml/2006/picture">
-                    <pic:pic xmlns:pic="http://schemas.openxmlformats.org/drawingml/2006/picture">
-                      <pic:nvPicPr>
-                        <pic:cNvPr id="4" name=""/>
-                        <pic:cNvPicPr/>
-                      </pic:nvPicPr>
-                      <pic:blipFill>
-                        <a:blip r:embed="rId4"/>
-                        <a:stretch/>
-                      </pic:blipFill>
-                      <pic:spPr>
-                        <a:xfrm>
-                          <a:off x="0" y="0"/>
-                          <a:ext cx="5934240" cy="7667640"/>
-                        </a:xfrm>
-                        <a:prstGeom prst="rect">
-                          <a:avLst/>
-                        </a:prstGeom>
-                        <a:noFill/>
-                        <a:ln w="0">
-                          <a:noFill/>
-                        </a:ln>
-                      </pic:spPr>
-                    </pic:pic>
-                  </a:graphicData>
-                </a:graphic>
-              </wp:inline>
-            </w:drawing>
-          </mc:Choice>
-          <mc:Fallback>
-            <w:pict>
               <v:shape id="shape_0" stroked="f" o:allowincell="t" style="width:467.2pt;height:603.7pt;mso-wrap-style:none;v-text-anchor:middle" type="_x0000_t75">
-                <v:imagedata r:id="rId5" o:detectmouseclick="t"/>
+                <v:imagedata r:id="rId4" o:detectmouseclick="t"/>
                 <v:stroke color="#3465a4" joinstyle="round" endcap="flat"/>
               </v:shape>
             </w:pict>
@@ -3785,16 +3735,16 @@
               <wp:inline distT="0" distB="0" distL="0" distR="0">
                 <wp:extent cx="5934075" cy="6696075"/>
                 <wp:effectExtent l="0" t="0" r="0" b="0"/>
-                <wp:docPr id="5" name=""/>
+                <wp:docPr id="4" name=""/>
                 <a:graphic xmlns:a="http://schemas.openxmlformats.org/drawingml/2006/main">
                   <a:graphicData uri="http://schemas.openxmlformats.org/drawingml/2006/picture">
                     <pic:pic xmlns:pic="http://schemas.openxmlformats.org/drawingml/2006/picture">
                       <pic:nvPicPr>
-                        <pic:cNvPr id="6" name=""/>
+                        <pic:cNvPr id="5" name=""/>
                         <pic:cNvPicPr/>
                       </pic:nvPicPr>
                       <pic:blipFill>
-                        <a:blip r:embed="rId6"/>
+                        <a:blip r:embed="rId5"/>
                         <a:stretch/>
                       </pic:blipFill>
                       <pic:spPr>
@@ -3819,7 +3769,7 @@
           <mc:Fallback>
             <w:pict>
               <v:shape id="shape_0" stroked="f" o:allowincell="t" style="width:467.2pt;height:527.2pt;mso-wrap-style:none;v-text-anchor:middle" type="_x0000_t75">
-                <v:imagedata r:id="rId7" o:detectmouseclick="t"/>
+                <v:imagedata r:id="rId6" o:detectmouseclick="t"/>
                 <v:stroke color="#3465a4" joinstyle="round" endcap="flat"/>
               </v:shape>
             </w:pict>
@@ -3877,7 +3827,7 @@
           <w:lang w:val="ru-RU"/>
         </w:rPr>
       </w:pPr>
-      <w:bookmarkStart w:id="27" w:name="__RefHeading___Toc2615_3177650637"/>
+      <w:bookmarkStart w:id="27" w:name="__RefHeading___Toc4313_3177650637"/>
       <w:bookmarkStart w:id="28" w:name="_Toc243341359"/>
       <w:bookmarkStart w:id="29" w:name="_Toc243321937"/>
       <w:bookmarkEnd w:id="27"/>
@@ -5573,7 +5523,7 @@
         <w:rPr>
           <w:lang w:val="ru-RU"/>
         </w:rPr>
-        <w:t>k_anonimity(table, qi, flag) – считает K по выбранным квази-идентификаторам. Если flag = True, дополнительно возвращает 5 худших значений K с долей строк и таблицу уникальных строк, если False – только K (так функция работает быстрее внутри цикла).</w:t>
+        <w:t>k_anonimity(table, qi, flag) – считает K, группируя строки по переданным столбцам: для входного датасета передаются все столбцы, для обезличенного – выбранные квази-идентификаторы. Если flag = True, дополнительно возвращает 5 худших значений K с долей строк и таблицу уникальных строк, если False – только K (так функция работает быстрее внутри цикла).</w:t>
       </w:r>
     </w:p>
     <w:p>
@@ -5761,7 +5711,7 @@
           <w:lang w:val="ru-RU"/>
         </w:rPr>
       </w:pPr>
-      <w:bookmarkStart w:id="30" w:name="__RefHeading___Toc2617_3177650637"/>
+      <w:bookmarkStart w:id="30" w:name="__RefHeading___Toc4315_3177650637"/>
       <w:bookmarkStart w:id="31" w:name="_Toc243341360"/>
       <w:bookmarkStart w:id="32" w:name="_Toc243321938"/>
       <w:bookmarkEnd w:id="30"/>
@@ -5802,7 +5752,13 @@
         <w:rPr>
           <w:lang w:val="ru-RU"/>
         </w:rPr>
-        <w:t>После запуска программа выведет пронумерованный список столбцов и попросит ввести номера квази-идентификаторов. Номера вводятся через пробел, например «2 3 4 7». Если ввести что-то кроме чисел, номер, которого нет в списке, или пустую строку – программа сообщит об ошибке и попросит ввести номера заново.</w:t>
+        <w:t xml:space="preserve">После запуска программа сообщит, что она читает датасет, надо немного подождать. </w:t>
+      </w:r>
+      <w:r>
+        <w:rPr>
+          <w:lang w:val="ru-RU"/>
+        </w:rPr>
+        <w:t>Сразу после запуска программа посчитает K для исходного датасета по всем столбцам и выведет его, 5 худших значений K и уникальные строки. Уникальных строк может быть очень много, поэтому выводятся только первые 10, а для остальных указывается их количество.</w:t>
       </w:r>
     </w:p>
     <w:p>
@@ -5816,7 +5772,7 @@
         <w:rPr>
           <w:lang w:val="ru-RU"/>
         </w:rPr>
-        <w:t>Дальше программа выведет значение K для датасета до обезличивания, 5 худших значений K и уникальные строки. Уникальных строк может быть очень много, поэтому выводятся только первые 10, а для остальных указывается их количество. После этого нужно немного подождать, пока идёт подбор уровней обобщения.</w:t>
+        <w:t>Затем программа выведет пронумерованный список столбцов и попросит ввести номера квази-идентификаторов. Номера вводятся через пробел, например «2 3 4 7». Если ввести что-то кроме чисел, номер, которого нет в списке, или пустую строку – программа сообщит об ошибке и попросит ввести номера заново. После этого нужно немного подождать, пока идёт подбор уровней обобщения.</w:t>
       </w:r>
     </w:p>
     <w:p>
@@ -5850,7 +5806,7 @@
           <w:lang w:val="ru-RU"/>
         </w:rPr>
       </w:pPr>
-      <w:bookmarkStart w:id="33" w:name="__RefHeading___Toc2619_3177650637"/>
+      <w:bookmarkStart w:id="33" w:name="__RefHeading___Toc4317_3177650637"/>
       <w:bookmarkStart w:id="34" w:name="_Toc243341361"/>
       <w:bookmarkStart w:id="35" w:name="_Toc243321939"/>
       <w:bookmarkEnd w:id="33"/>
@@ -5953,7 +5909,7 @@
           <w:lang w:val="ru-RU"/>
         </w:rPr>
       </w:pPr>
-      <w:bookmarkStart w:id="36" w:name="__RefHeading___Toc2621_3177650637"/>
+      <w:bookmarkStart w:id="36" w:name="__RefHeading___Toc4319_3177650637"/>
       <w:bookmarkStart w:id="37" w:name="_Toc243341362"/>
       <w:bookmarkStart w:id="38" w:name="_Toc243321940"/>
       <w:bookmarkEnd w:id="36"/>
@@ -5998,30 +5954,44 @@
         <w:rPr>
           <w:lang w:val="ru-RU"/>
         </w:rPr>
-        <w:t xml:space="preserve">Запускаем файл main.py с помощью интерпретатора python. Программа выводит список столбцов и просит ввести номера квази-идентификаторов. Мы хотим выбрать все столбцы, то есть вводим </w:t>
-      </w:r>
-      <w:r>
-        <w:rPr/>
-        <w:t>«1 2 3 4 5 6 7 8».</w:t>
-      </w:r>
-    </w:p>
-    <w:p>
-      <w:pPr>
-        <w:pStyle w:val="Normal"/>
-        <w:ind w:hanging="0"/>
-        <w:jc w:val="center"/>
-        <w:rPr>
-          <w:sz w:val="24"/>
-          <w:szCs w:val="24"/>
-        </w:rPr>
-      </w:pPr>
-      <w:r>
-        <w:rPr/>
+        <w:t xml:space="preserve">Запускаем файл main.py с помощью интерпретатора python. </w:t>
+      </w:r>
+      <w:r>
+        <w:rPr>
+          <w:lang w:val="ru-RU"/>
+        </w:rPr>
+        <w:t>Сначала программа считывает датасет и сообщает об этом.</w:t>
+      </w:r>
+    </w:p>
+    <w:p>
+      <w:pPr>
+        <w:pStyle w:val="ListParagraph"/>
+        <w:numPr>
+          <w:ilvl w:val="0"/>
+          <w:numId w:val="0"/>
+        </w:numPr>
+        <w:ind w:hanging="0" w:start="0"/>
+        <w:rPr>
+          <w:lang w:val="ru-RU"/>
+        </w:rPr>
+      </w:pPr>
+      <w:r>
+        <w:rPr>
+          <w:lang w:val="ru-RU"/>
+        </w:rPr>
         <w:drawing>
-          <wp:inline distT="0" distB="0" distL="0" distR="0">
-            <wp:extent cx="5939790" cy="761365"/>
+          <wp:anchor distT="0" distB="0" distL="0" distR="0" simplePos="0" relativeHeight="10" behindDoc="0" locked="0" layoutInCell="0" allowOverlap="1">
+            <wp:simplePos x="0" y="0"/>
+            <wp:positionH relativeFrom="column">
+              <wp:align>center</wp:align>
+            </wp:positionH>
+            <wp:positionV relativeFrom="paragraph">
+              <wp:posOffset>635</wp:posOffset>
+            </wp:positionV>
+            <wp:extent cx="5482590" cy="126365"/>
             <wp:effectExtent l="0" t="0" r="0" b="0"/>
-            <wp:docPr id="7" name="Рисунок 1"/>
+            <wp:wrapSquare wrapText="largest"/>
+            <wp:docPr id="6" name="Image1"/>
             <wp:cNvGraphicFramePr>
               <a:graphicFrameLocks xmlns:a="http://schemas.openxmlformats.org/drawingml/2006/main" noChangeAspect="1"/>
             </wp:cNvGraphicFramePr>
@@ -6029,13 +5999,167 @@
               <a:graphicData uri="http://schemas.openxmlformats.org/drawingml/2006/picture">
                 <pic:pic xmlns:pic="http://schemas.openxmlformats.org/drawingml/2006/picture">
                   <pic:nvPicPr>
-                    <pic:cNvPr id="7" name="Рисунок 1"/>
+                    <pic:cNvPr id="6" name="Image1"/>
+                    <pic:cNvPicPr>
+                      <a:picLocks noChangeAspect="1" noChangeArrowheads="1"/>
+                    </pic:cNvPicPr>
+                  </pic:nvPicPr>
+                  <pic:blipFill>
+                    <a:blip r:embed="rId7"/>
+                    <a:stretch>
+                      <a:fillRect/>
+                    </a:stretch>
+                  </pic:blipFill>
+                  <pic:spPr bwMode="auto">
+                    <a:xfrm>
+                      <a:off x="0" y="0"/>
+                      <a:ext cx="5482590" cy="126365"/>
+                    </a:xfrm>
+                    <a:prstGeom prst="rect">
+                      <a:avLst/>
+                    </a:prstGeom>
+                    <a:noFill/>
+                  </pic:spPr>
+                </pic:pic>
+              </a:graphicData>
+            </a:graphic>
+          </wp:anchor>
+        </w:drawing>
+      </w:r>
+    </w:p>
+    <w:p>
+      <w:pPr>
+        <w:pStyle w:val="ListParagraph"/>
+        <w:numPr>
+          <w:ilvl w:val="0"/>
+          <w:numId w:val="3"/>
+        </w:numPr>
+        <w:rPr>
+          <w:lang w:val="ru-RU"/>
+        </w:rPr>
+      </w:pPr>
+      <w:r>
+        <w:rPr>
+          <w:lang w:val="ru-RU"/>
+        </w:rPr>
+        <w:t>Потом п</w:t>
+      </w:r>
+      <w:r>
+        <w:rPr>
+          <w:lang w:val="ru-RU"/>
+        </w:rPr>
+        <w:t>рограмма выводит значение K для исходного датасета по всем столбцам, 5 худших значений K и уникальные строки. На моём датасете получилось K равное 1 и что все строки в датасете уникальные.</w:t>
+      </w:r>
+    </w:p>
+    <w:p>
+      <w:pPr>
+        <w:pStyle w:val="Normal"/>
+        <w:ind w:hanging="0"/>
+        <w:jc w:val="center"/>
+        <w:rPr>
+          <w:sz w:val="24"/>
+          <w:szCs w:val="24"/>
+        </w:rPr>
+      </w:pPr>
+      <w:r>
+        <w:rPr/>
+        <w:drawing>
+          <wp:inline distT="0" distB="0" distL="0" distR="0">
+            <wp:extent cx="5939790" cy="1327785"/>
+            <wp:effectExtent l="0" t="0" r="0" b="0"/>
+            <wp:docPr id="7" name="Рисунок 2"/>
+            <wp:cNvGraphicFramePr>
+              <a:graphicFrameLocks xmlns:a="http://schemas.openxmlformats.org/drawingml/2006/main" noChangeAspect="1"/>
+            </wp:cNvGraphicFramePr>
+            <a:graphic xmlns:a="http://schemas.openxmlformats.org/drawingml/2006/main">
+              <a:graphicData uri="http://schemas.openxmlformats.org/drawingml/2006/picture">
+                <pic:pic xmlns:pic="http://schemas.openxmlformats.org/drawingml/2006/picture">
+                  <pic:nvPicPr>
+                    <pic:cNvPr id="7" name="Рисунок 2"/>
                     <pic:cNvPicPr>
                       <a:picLocks noChangeAspect="1" noChangeArrowheads="1"/>
                     </pic:cNvPicPr>
                   </pic:nvPicPr>
                   <pic:blipFill>
                     <a:blip r:embed="rId8"/>
+                    <a:stretch>
+                      <a:fillRect/>
+                    </a:stretch>
+                  </pic:blipFill>
+                  <pic:spPr bwMode="auto">
+                    <a:xfrm>
+                      <a:off x="0" y="0"/>
+                      <a:ext cx="5939790" cy="1327785"/>
+                    </a:xfrm>
+                    <a:prstGeom prst="rect">
+                      <a:avLst/>
+                    </a:prstGeom>
+                    <a:noFill/>
+                  </pic:spPr>
+                </pic:pic>
+              </a:graphicData>
+            </a:graphic>
+          </wp:inline>
+        </w:drawing>
+      </w:r>
+      <w:r>
+        <w:rPr>
+          <w:sz w:val="24"/>
+          <w:szCs w:val="24"/>
+          <w:lang w:val="ru-RU"/>
+        </w:rPr>
+        <w:t>рисунок 9.1 – Значение K до обезличивания</w:t>
+      </w:r>
+    </w:p>
+    <w:p>
+      <w:pPr>
+        <w:pStyle w:val="ListParagraph"/>
+        <w:numPr>
+          <w:ilvl w:val="0"/>
+          <w:numId w:val="3"/>
+        </w:numPr>
+        <w:rPr>
+          <w:lang w:val="ru-RU"/>
+        </w:rPr>
+      </w:pPr>
+      <w:r>
+        <w:rPr>
+          <w:lang w:val="ru-RU"/>
+        </w:rPr>
+        <w:t>Затем программа выводит список столбцов и просит ввести номера квази-идентификаторов. Мы хотим выбрать все столбцы, то есть вводим «1 2 3 4 5 6 7 8».</w:t>
+      </w:r>
+    </w:p>
+    <w:p>
+      <w:pPr>
+        <w:pStyle w:val="Normal"/>
+        <w:ind w:hanging="0"/>
+        <w:jc w:val="center"/>
+        <w:rPr>
+          <w:sz w:val="24"/>
+          <w:szCs w:val="24"/>
+        </w:rPr>
+      </w:pPr>
+      <w:r>
+        <w:rPr/>
+        <w:drawing>
+          <wp:inline distT="0" distB="0" distL="0" distR="0">
+            <wp:extent cx="5939790" cy="761365"/>
+            <wp:effectExtent l="0" t="0" r="0" b="0"/>
+            <wp:docPr id="8" name="Рисунок 1"/>
+            <wp:cNvGraphicFramePr>
+              <a:graphicFrameLocks xmlns:a="http://schemas.openxmlformats.org/drawingml/2006/main" noChangeAspect="1"/>
+            </wp:cNvGraphicFramePr>
+            <a:graphic xmlns:a="http://schemas.openxmlformats.org/drawingml/2006/main">
+              <a:graphicData uri="http://schemas.openxmlformats.org/drawingml/2006/picture">
+                <pic:pic xmlns:pic="http://schemas.openxmlformats.org/drawingml/2006/picture">
+                  <pic:nvPicPr>
+                    <pic:cNvPr id="8" name="Рисунок 1"/>
+                    <pic:cNvPicPr>
+                      <a:picLocks noChangeAspect="1" noChangeArrowheads="1"/>
+                    </pic:cNvPicPr>
+                  </pic:nvPicPr>
+                  <pic:blipFill>
+                    <a:blip r:embed="rId9"/>
                     <a:stretch>
                       <a:fillRect/>
                     </a:stretch>
@@ -6062,7 +6186,7 @@
           <w:szCs w:val="24"/>
           <w:lang w:val="ru-RU"/>
         </w:rPr>
-        <w:t>рисунок 9.1 – Выбор квази-идентификаторов</w:t>
+        <w:t>рисунок 9.2 – Выбор квази-идентификаторов</w:t>
       </w:r>
     </w:p>
     <w:p>
@@ -6080,7 +6204,7 @@
         <w:rPr>
           <w:lang w:val="ru-RU"/>
         </w:rPr>
-        <w:t xml:space="preserve">Программа выводит значение K до обезличивания, 5 худших значений K и уникальные строки. На моём датасете получилось </w:t>
+        <w:t xml:space="preserve">После подбора уровней программа выводит итоговые уровни обобщения, количество удалённых строк и значение K после обезличивания. На моём датасете получилось, что удалено только 3,54% строк и минимальное </w:t>
       </w:r>
       <w:r>
         <w:rPr/>
@@ -6090,97 +6214,7 @@
         <w:rPr>
           <w:lang w:val="ru-RU"/>
         </w:rPr>
-        <w:t xml:space="preserve"> равное 1 и что все строки в датасете уникальные.</w:t>
-      </w:r>
-    </w:p>
-    <w:p>
-      <w:pPr>
-        <w:pStyle w:val="Normal"/>
-        <w:ind w:hanging="0"/>
-        <w:jc w:val="center"/>
-        <w:rPr>
-          <w:sz w:val="24"/>
-          <w:szCs w:val="24"/>
-        </w:rPr>
-      </w:pPr>
-      <w:r>
-        <w:rPr/>
-        <w:drawing>
-          <wp:inline distT="0" distB="0" distL="0" distR="0">
-            <wp:extent cx="5939790" cy="1327785"/>
-            <wp:effectExtent l="0" t="0" r="0" b="0"/>
-            <wp:docPr id="8" name="Рисунок 2"/>
-            <wp:cNvGraphicFramePr>
-              <a:graphicFrameLocks xmlns:a="http://schemas.openxmlformats.org/drawingml/2006/main" noChangeAspect="1"/>
-            </wp:cNvGraphicFramePr>
-            <a:graphic xmlns:a="http://schemas.openxmlformats.org/drawingml/2006/main">
-              <a:graphicData uri="http://schemas.openxmlformats.org/drawingml/2006/picture">
-                <pic:pic xmlns:pic="http://schemas.openxmlformats.org/drawingml/2006/picture">
-                  <pic:nvPicPr>
-                    <pic:cNvPr id="8" name="Рисунок 2"/>
-                    <pic:cNvPicPr>
-                      <a:picLocks noChangeAspect="1" noChangeArrowheads="1"/>
-                    </pic:cNvPicPr>
-                  </pic:nvPicPr>
-                  <pic:blipFill>
-                    <a:blip r:embed="rId9"/>
-                    <a:stretch>
-                      <a:fillRect/>
-                    </a:stretch>
-                  </pic:blipFill>
-                  <pic:spPr bwMode="auto">
-                    <a:xfrm>
-                      <a:off x="0" y="0"/>
-                      <a:ext cx="5939790" cy="1327785"/>
-                    </a:xfrm>
-                    <a:prstGeom prst="rect">
-                      <a:avLst/>
-                    </a:prstGeom>
-                    <a:noFill/>
-                  </pic:spPr>
-                </pic:pic>
-              </a:graphicData>
-            </a:graphic>
-          </wp:inline>
-        </w:drawing>
-      </w:r>
-      <w:r>
-        <w:rPr>
-          <w:sz w:val="24"/>
-          <w:szCs w:val="24"/>
-          <w:lang w:val="ru-RU"/>
-        </w:rPr>
-        <w:t>рисунок 9.2 – Значение K до обезличивания</w:t>
-      </w:r>
-    </w:p>
-    <w:p>
-      <w:pPr>
-        <w:pStyle w:val="ListParagraph"/>
-        <w:numPr>
-          <w:ilvl w:val="0"/>
-          <w:numId w:val="3"/>
-        </w:numPr>
-        <w:rPr>
-          <w:lang w:val="ru-RU"/>
-        </w:rPr>
-      </w:pPr>
-      <w:r>
-        <w:rPr>
-          <w:lang w:val="ru-RU"/>
-        </w:rPr>
-        <w:t xml:space="preserve">После подбора уровней программа выводит итоговые уровни обобщения, количество удалённых строк, значение K после обезличивания, худшие значения K, количество строк с ним, их процент в датасете, количество уникальных строк </w:t>
-      </w:r>
-      <w:r>
-        <w:rPr>
-          <w:lang w:val="ru-RU"/>
-        </w:rPr>
-        <w:t>и если они есть: выводит их</w:t>
-      </w:r>
-      <w:r>
-        <w:rPr>
-          <w:lang w:val="ru-RU"/>
-        </w:rPr>
-        <w:t>. На моём датасете получилось, что удалено только 3,54% строк и минимальное K это 10 с 230 строками, без единой уникальной строки.</w:t>
+        <w:t xml:space="preserve"> это 10 с 230 строками, без единой уникальной строки.</w:t>
       </w:r>
     </w:p>
     <w:p>
@@ -6530,7 +6564,7 @@
           <w:lang w:val="ru-RU"/>
         </w:rPr>
       </w:pPr>
-      <w:bookmarkStart w:id="39" w:name="__RefHeading___Toc2623_3177650637"/>
+      <w:bookmarkStart w:id="39" w:name="__RefHeading___Toc4321_3177650637"/>
       <w:bookmarkStart w:id="40" w:name="_Toc243341363"/>
       <w:bookmarkStart w:id="41" w:name="_Toc243321941"/>
       <w:bookmarkStart w:id="42" w:name="_GoBack"/>
@@ -7390,7 +7424,7 @@
           <w:lang w:val="ru-RU"/>
         </w:rPr>
       </w:pPr>
-      <w:bookmarkStart w:id="43" w:name="__RefHeading___Toc2625_3177650637"/>
+      <w:bookmarkStart w:id="43" w:name="__RefHeading___Toc4323_3177650637"/>
       <w:bookmarkStart w:id="44" w:name="_Toc243341364"/>
       <w:bookmarkStart w:id="45" w:name="_Toc243321942"/>
       <w:bookmarkEnd w:id="43"/>
@@ -7416,7 +7450,7 @@
         <w:rPr>
           <w:lang w:val="ru-RU"/>
         </w:rPr>
-        <w:t>В результате выполнения данной лабораторной работы были изучены методы обезличивания персональных данных и метрика k-anonymity. Была написана программа, которая заменяет прямые идентификаторы (паспорт и СНИЛС), считает K по выбранным пользователем квази-идентификаторам для входного и обезличенного датасета, подбирает уровни обобщения жадным алгоритмом в два этапа и удаляет оставшиеся редкие строки локальным подавлением, при этом в датасете сохраняются все столбцы.</w:t>
+        <w:t>В результате выполнения данной лабораторной работы были изучены методы обезличивания персональных данных и метрика k-anonymity. Была написана программа, которая заменяет прямые идентификаторы (паспорт и СНИЛС), считает K для входного датасета по всем столбцам и для обезличенного – по выбранным пользователем квази-идентификаторам, подбирает уровни обобщения жадным алгоритмом в два этапа и удаляет оставшиеся редкие строки локальным подавлением, при этом в датасете сохраняются все столбцы.</w:t>
       </w:r>
     </w:p>
     <w:p>

</xml_diff>